<commit_message>
Fix accents in practica 1 report
</commit_message>
<xml_diff>
--- a/practica1-breeze/evidencias/Reporte_Practica_01_Autenticacion_Breeze.docx
+++ b/practica1-breeze/evidencias/Reporte_Practica_01_Autenticacion_Breeze.docx
@@ -15,7 +15,7 @@
           <w:color w:val="000000"/>
           <w:sz w:val="52"/>
         </w:rPr>
-        <w:t>PR?CTICA 1</w:t>
+        <w:t>PRÁCTICA 1</w:t>
       </w:r>
     </w:p>
     <w:p>
@@ -31,7 +31,7 @@
           <w:color w:val="000000"/>
           <w:sz w:val="40"/>
         </w:rPr>
-        <w:t>Autenticaci?n con Laravel Breeze</w:t>
+        <w:t>Autenticación con Laravel Breeze</w:t>
       </w:r>
     </w:p>
     <w:p>
@@ -293,7 +293,7 @@
                 <w:color w:val="000000"/>
                 <w:sz w:val="21"/>
               </w:rPr>
-              <w:t>Autenticaci?n y perfil con Breeze</w:t>
+              <w:t>Autenticación y perfil con Breeze</w:t>
             </w:r>
           </w:p>
         </w:tc>
@@ -301,33 +301,17 @@
     </w:tbl>
     <w:p>
       <w:pPr>
-        <w:spacing w:before="240" w:after="0" w:line="240" w:lineRule="auto"/>
+        <w:spacing w:before="200" w:after="0" w:line="240" w:lineRule="auto"/>
+        <w:jc w:val="center"/>
       </w:pPr>
       <w:r>
         <w:rPr>
           <w:rFonts w:ascii="Calibri" w:hAnsi="Calibri"/>
           <w:b/>
           <w:i w:val="0"/>
-          <w:color w:val="2E74B5"/>
-          <w:sz w:val="24"/>
-        </w:rPr>
-        <w:t>Objetivo general</w:t>
-      </w:r>
-    </w:p>
-    <w:p>
-      <w:pPr>
-        <w:spacing w:before="0" w:after="0" w:line="276" w:lineRule="auto"/>
-        <w:jc w:val="both"/>
-      </w:pPr>
-      <w:r>
-        <w:rPr>
-          <w:rFonts w:ascii="Calibri" w:hAnsi="Calibri"/>
-          <w:b w:val="0"/>
-          <w:i w:val="0"/>
-          <w:color w:val="000000"/>
           <w:sz w:val="22"/>
         </w:rPr>
-        <w:t>Implementar el flujo de autenticaci?n de Laravel Breeze, ampliar el registro de usuarios con el campo telefono, proteger el acceso al dashboard y documentar el resultado con evidencias reales del funcionamiento.</w:t>
+        <w:t>Nombre del alumno: Alejandro Avalos Espinosa</w:t>
       </w:r>
     </w:p>
     <w:p>
@@ -338,7 +322,6 @@
     <w:p>
       <w:pPr>
         <w:pStyle w:val="Heading1"/>
-        <w:jc w:val="left"/>
       </w:pPr>
       <w:r>
         <w:t>1. Desarrollo realizado</w:t>
@@ -350,13 +333,7 @@
         <w:jc w:val="both"/>
       </w:pPr>
       <w:r>
-        <w:rPr>
-          <w:rFonts w:ascii="Calibri" w:hAnsi="Calibri"/>
-          <w:b w:val="0"/>
-          <w:i w:val="0"/>
-          <w:sz w:val="22"/>
-        </w:rPr>
-        <w:t>Se trabaj? sobre el proyecto Laravel existente para completar la pr?ctica de autenticaci?n. El flujo final incluye registro, inicio de sesi?n, protecci?n del dashboard y una vista de perfil personalizada con el n?mero telef?nico del usuario.</w:t>
+        <w:t>Se trabajó sobre el proyecto Laravel existente para completar la práctica de autenticación. El flujo final incluye registro, inicio de sesión, protección del dashboard y una vista de perfil personalizada con el número telefónico del usuario.</w:t>
       </w:r>
     </w:p>
     <w:p>
@@ -365,7 +342,7 @@
         <w:spacing w:before="0" w:after="40" w:line="259" w:lineRule="auto"/>
       </w:pPr>
       <w:r>
-        <w:t>Se a?adi? la columna telefono a la tabla users mediante una migraci?n nueva.</w:t>
+        <w:t>Se añadió la columna telefono a la tabla users mediante una migración nueva.</w:t>
       </w:r>
     </w:p>
     <w:p>
@@ -374,7 +351,7 @@
         <w:spacing w:before="0" w:after="40" w:line="259" w:lineRule="auto"/>
       </w:pPr>
       <w:r>
-        <w:t>Se actualiz? el formulario de registro para capturar nombre, correo, contrase?a y tel?fono.</w:t>
+        <w:t>Se actualizó el formulario de registro para capturar nombre, correo, contraseña y teléfono.</w:t>
       </w:r>
     </w:p>
     <w:p>
@@ -383,7 +360,7 @@
         <w:spacing w:before="0" w:after="40" w:line="259" w:lineRule="auto"/>
       </w:pPr>
       <w:r>
-        <w:t>Se ajust? RegisteredUserController para validar y guardar el tel?fono del usuario.</w:t>
+        <w:t>Se ajustó RegisteredUserController para validar y guardar el teléfono del usuario.</w:t>
       </w:r>
     </w:p>
     <w:p>
@@ -392,7 +369,7 @@
         <w:spacing w:before="0" w:after="40" w:line="259" w:lineRule="auto"/>
       </w:pPr>
       <w:r>
-        <w:t>Se cre? la ruta /perfil y la vista correspondiente con la informaci?n b?sica de la cuenta.</w:t>
+        <w:t>Se creó la ruta /perfil y la vista correspondiente con la información básica de la cuenta.</w:t>
       </w:r>
     </w:p>
     <w:p>
@@ -401,7 +378,7 @@
         <w:spacing w:before="0" w:after="40" w:line="259" w:lineRule="auto"/>
       </w:pPr>
       <w:r>
-        <w:t>Se protegi? el dashboard con middleware auth y verified.</w:t>
+        <w:t>Se protegió el dashboard con middleware auth y verified.</w:t>
       </w:r>
     </w:p>
     <w:p>
@@ -410,7 +387,7 @@
         <w:spacing w:before="0" w:after="40" w:line="259" w:lineRule="auto"/>
       </w:pPr>
       <w:r>
-        <w:t>Se actualiz? la navegaci?n para acceder al perfil desde el men? autenticado.</w:t>
+        <w:t>Se actualizó la navegación para acceder al perfil desde el menú autenticado.</w:t>
       </w:r>
     </w:p>
     <w:p>
@@ -444,13 +421,7 @@
         <w:jc w:val="both"/>
       </w:pPr>
       <w:r>
-        <w:rPr>
-          <w:rFonts w:ascii="Calibri" w:hAnsi="Calibri"/>
-          <w:b w:val="0"/>
-          <w:i w:val="0"/>
-          <w:sz w:val="22"/>
-        </w:rPr>
-        <w:t>Se verifica que el formulario de registro incluye el campo Telefono.</w:t>
+        <w:t>Se verifica que el formulario de registro incluye el campo Teléfono.</w:t>
       </w:r>
     </w:p>
     <w:p>
@@ -514,7 +485,7 @@
         <w:pStyle w:val="Heading2"/>
       </w:pPr>
       <w:r>
-        <w:t>Captura 2. Dashboard despu?s del registro</w:t>
+        <w:t>Captura 2. Dashboard después del registro</w:t>
       </w:r>
     </w:p>
     <w:p>
@@ -523,13 +494,7 @@
         <w:jc w:val="both"/>
       </w:pPr>
       <w:r>
-        <w:rPr>
-          <w:rFonts w:ascii="Calibri" w:hAnsi="Calibri"/>
-          <w:b w:val="0"/>
-          <w:i w:val="0"/>
-          <w:sz w:val="22"/>
-        </w:rPr>
-        <w:t>La sesi?n se inicia correctamente y el usuario accede al panel principal.</w:t>
+        <w:t>La sesión se inicia correctamente y el usuario accede al panel principal.</w:t>
       </w:r>
     </w:p>
     <w:p>
@@ -585,7 +550,7 @@
           <w:color w:val="434343"/>
           <w:sz w:val="18"/>
         </w:rPr>
-        <w:t>Captura 2. Dashboard despu?s del registro</w:t>
+        <w:t>Captura 2. Dashboard después del registro</w:t>
       </w:r>
     </w:p>
     <w:p>
@@ -602,13 +567,7 @@
         <w:jc w:val="both"/>
       </w:pPr>
       <w:r>
-        <w:rPr>
-          <w:rFonts w:ascii="Calibri" w:hAnsi="Calibri"/>
-          <w:b w:val="0"/>
-          <w:i w:val="0"/>
-          <w:sz w:val="22"/>
-        </w:rPr>
-        <w:t>Se muestra la informaci?n registrada, incluido el tel?fono.</w:t>
+        <w:t>Se muestra la información registrada, incluido el teléfono.</w:t>
       </w:r>
     </w:p>
     <w:p>
@@ -672,7 +631,7 @@
         <w:pStyle w:val="Heading2"/>
       </w:pPr>
       <w:r>
-        <w:t>Captura 4. Rutas de autenticaci?n</w:t>
+        <w:t>Captura 4. Rutas de autenticación</w:t>
       </w:r>
     </w:p>
     <w:p>
@@ -681,12 +640,6 @@
         <w:jc w:val="both"/>
       </w:pPr>
       <w:r>
-        <w:rPr>
-          <w:rFonts w:ascii="Calibri" w:hAnsi="Calibri"/>
-          <w:b w:val="0"/>
-          <w:i w:val="0"/>
-          <w:sz w:val="22"/>
-        </w:rPr>
         <w:t>Se validan las rutas auth principales y la ruta personalizada /perfil.</w:t>
       </w:r>
     </w:p>
@@ -743,7 +696,7 @@
           <w:color w:val="434343"/>
           <w:sz w:val="18"/>
         </w:rPr>
-        <w:t>Captura 4. Rutas de autenticaci?n</w:t>
+        <w:t>Captura 4. Rutas de autenticación</w:t>
       </w:r>
     </w:p>
     <w:p>
@@ -760,13 +713,7 @@
         <w:jc w:val="both"/>
       </w:pPr>
       <w:r>
-        <w:rPr>
-          <w:rFonts w:ascii="Calibri" w:hAnsi="Calibri"/>
-          <w:b w:val="0"/>
-          <w:i w:val="0"/>
-          <w:sz w:val="22"/>
-        </w:rPr>
-        <w:t>La pr?ctica qued? funcional: el sistema permite registrar usuarios con tel?fono, iniciar sesi?n, entrar al dashboard y consultar una vista de perfil con los datos capturados. Las capturas anexadas muestran el flujo completo de funcionamiento y las rutas principales habilitadas.</w:t>
+        <w:t>La práctica quedó funcional: el sistema permite registrar usuarios con teléfono, iniciar sesión, entrar al dashboard y consultar una vista de perfil con los datos capturados. Las capturas anexadas muestran el flujo completo de funcionamiento y las rutas principales habilitadas.</w:t>
       </w:r>
     </w:p>
     <w:p>
@@ -775,20 +722,12 @@
         <w:jc w:val="both"/>
       </w:pPr>
       <w:r>
-        <w:rPr>
-          <w:rFonts w:ascii="Calibri" w:hAnsi="Calibri"/>
-          <w:b/>
-          <w:i w:val="0"/>
-          <w:sz w:val="22"/>
-        </w:rPr>
         <w:t>Nombre del alumno: Alejandro Avalos Espinosa</w:t>
       </w:r>
     </w:p>
     <w:sectPr>
       <w:headerReference w:type="default" r:id="rId9"/>
       <w:footerReference w:type="default" r:id="rId10"/>
-      <w:headerReference w:type="first" r:id="rId15"/>
-      <w:footerReference w:type="first" r:id="rId16"/>
       <w:pgSz w:w="12240" w:h="15840"/>
       <w:pgMar w:top="1440" w:right="1440" w:bottom="1440" w:left="1440" w:header="648" w:footer="648" w:gutter="0"/>
       <w:cols w:space="720"/>
@@ -814,14 +753,9 @@
         <w:color w:val="666666"/>
         <w:sz w:val="18"/>
       </w:rPr>
-      <w:t xml:space="preserve">P?gina </w:t>
+      <w:t xml:space="preserve">Página </w:t>
     </w:r>
     <w:r>
-      <w:rPr>
-        <w:rFonts w:ascii="Calibri" w:hAnsi="Calibri"/>
-        <w:color w:val="666666"/>
-        <w:sz w:val="18"/>
-      </w:rPr>
       <w:fldChar w:fldCharType="begin"/>
       <w:instrText xml:space="preserve"> PAGE </w:instrText>
       <w:fldChar w:fldCharType="end"/>
@@ -830,17 +764,6 @@
 </w:ftr>
 </file>
 
-<file path=word/footer2.xml><?xml version="1.0" encoding="utf-8"?>
-<w:ftr xmlns:m="http://schemas.openxmlformats.org/officeDocument/2006/math" xmlns:mc="http://schemas.openxmlformats.org/markup-compatibility/2006" xmlns:mo="http://schemas.microsoft.com/office/mac/office/2008/main" xmlns:mv="urn:schemas-microsoft-com:mac:vml" xmlns:o="urn:schemas-microsoft-com:office:office" xmlns:r="http://schemas.openxmlformats.org/officeDocument/2006/relationships" xmlns:v="urn:schemas-microsoft-com:vml" xmlns:w10="urn:schemas-microsoft-com:office:word" xmlns:w14="http://schemas.microsoft.com/office/word/2010/wordml" xmlns:w="http://schemas.openxmlformats.org/wordprocessingml/2006/main" xmlns:wne="http://schemas.microsoft.com/office/word/2006/wordml" xmlns:wp14="http://schemas.microsoft.com/office/word/2010/wordprocessingDrawing" xmlns:wp="http://schemas.openxmlformats.org/drawingml/2006/wordprocessingDrawing" xmlns:wpc="http://schemas.microsoft.com/office/word/2010/wordprocessingCanvas" xmlns:wpg="http://schemas.microsoft.com/office/word/2010/wordprocessingGroup" xmlns:wpi="http://schemas.microsoft.com/office/word/2010/wordprocessingInk" xmlns:wps="http://schemas.microsoft.com/office/word/2010/wordprocessingShape" mc:Ignorable="w14 wp14">
-  <w:p>
-    <w:pPr>
-      <w:pStyle w:val="Footer"/>
-    </w:pPr>
-    <w:r/>
-  </w:p>
-</w:ftr>
-</file>
-
 <file path=word/header1.xml><?xml version="1.0" encoding="utf-8"?>
 <w:hdr xmlns:m="http://schemas.openxmlformats.org/officeDocument/2006/math" xmlns:mc="http://schemas.openxmlformats.org/markup-compatibility/2006" xmlns:mo="http://schemas.microsoft.com/office/mac/office/2008/main" xmlns:mv="urn:schemas-microsoft-com:mac:vml" xmlns:o="urn:schemas-microsoft-com:office:office" xmlns:r="http://schemas.openxmlformats.org/officeDocument/2006/relationships" xmlns:v="urn:schemas-microsoft-com:vml" xmlns:w10="urn:schemas-microsoft-com:office:word" xmlns:w14="http://schemas.microsoft.com/office/word/2010/wordml" xmlns:w="http://schemas.openxmlformats.org/wordprocessingml/2006/main" xmlns:wne="http://schemas.microsoft.com/office/word/2006/wordml" xmlns:wp14="http://schemas.microsoft.com/office/word/2010/wordprocessingDrawing" xmlns:wp="http://schemas.openxmlformats.org/drawingml/2006/wordprocessingDrawing" xmlns:wpc="http://schemas.microsoft.com/office/word/2010/wordprocessingCanvas" xmlns:wpg="http://schemas.microsoft.com/office/word/2010/wordprocessingGroup" xmlns:wpi="http://schemas.microsoft.com/office/word/2010/wordprocessingInk" xmlns:wps="http://schemas.microsoft.com/office/word/2010/wordprocessingShape" mc:Ignorable="w14 wp14">
   <w:p>
@@ -856,19 +779,8 @@
         <w:color w:val="666666"/>
         <w:sz w:val="18"/>
       </w:rPr>
-      <w:t>Pr?ctica 1. Autenticaci?n con Laravel Breeze</w:t>
+      <w:t>Práctica 1. Autenticación con Laravel Breeze</w:t>
     </w:r>
-  </w:p>
-</w:hdr>
-</file>
-
-<file path=word/header2.xml><?xml version="1.0" encoding="utf-8"?>
-<w:hdr xmlns:m="http://schemas.openxmlformats.org/officeDocument/2006/math" xmlns:mc="http://schemas.openxmlformats.org/markup-compatibility/2006" xmlns:mo="http://schemas.microsoft.com/office/mac/office/2008/main" xmlns:mv="urn:schemas-microsoft-com:mac:vml" xmlns:o="urn:schemas-microsoft-com:office:office" xmlns:r="http://schemas.openxmlformats.org/officeDocument/2006/relationships" xmlns:v="urn:schemas-microsoft-com:vml" xmlns:w10="urn:schemas-microsoft-com:office:word" xmlns:w14="http://schemas.microsoft.com/office/word/2010/wordml" xmlns:w="http://schemas.openxmlformats.org/wordprocessingml/2006/main" xmlns:wne="http://schemas.microsoft.com/office/word/2006/wordml" xmlns:wp14="http://schemas.microsoft.com/office/word/2010/wordprocessingDrawing" xmlns:wp="http://schemas.openxmlformats.org/drawingml/2006/wordprocessingDrawing" xmlns:wpc="http://schemas.microsoft.com/office/word/2010/wordprocessingCanvas" xmlns:wpg="http://schemas.microsoft.com/office/word/2010/wordprocessingGroup" xmlns:wpi="http://schemas.microsoft.com/office/word/2010/wordprocessingInk" xmlns:wps="http://schemas.microsoft.com/office/word/2010/wordprocessingShape" mc:Ignorable="w14 wp14">
-  <w:p>
-    <w:pPr>
-      <w:pStyle w:val="Header"/>
-    </w:pPr>
-    <w:r/>
   </w:p>
 </w:hdr>
 </file>

</xml_diff>